<commit_message>
chore(sample): 测试合同补全 13/17 条，编号 1-20 连续
</commit_message>
<xml_diff>
--- a/faheng-api/sample_contract.docx
+++ b/faheng-api/sample_contract.docx
@@ -390,6 +390,39 @@
           <w:rFonts w:ascii="Times New Roman" w:hAnsi="Times New Roman" w:eastAsia="宋体"/>
           <w:b/>
         </w:rPr>
+        <w:t>第十三条 个人信息处理与跨境传输</w:t>
+      </w:r>
+    </w:p>
+    <w:p>
+      <w:r>
+        <w:rPr>
+          <w:rFonts w:ascii="Times New Roman" w:hAnsi="Times New Roman" w:eastAsia="宋体"/>
+        </w:rPr>
+        <w:t>13.1 乙方为向甲方提供服务所必需，可将甲方提供的员工账号、邮箱、手机号及访问日志存储于境外服务器。</w:t>
+      </w:r>
+    </w:p>
+    <w:p>
+      <w:r>
+        <w:rPr>
+          <w:rFonts w:ascii="Times New Roman" w:hAnsi="Times New Roman" w:eastAsia="宋体"/>
+        </w:rPr>
+        <w:t>13.2 跨境传输前乙方无需单独取得甲方或个人信息主体的同意，甲方在服务期内使用即视为概括授权。</w:t>
+      </w:r>
+    </w:p>
+    <w:p>
+      <w:r>
+        <w:rPr>
+          <w:rFonts w:ascii="Times New Roman" w:hAnsi="Times New Roman" w:eastAsia="宋体"/>
+        </w:rPr>
+        <w:t>13.3 乙方可就上述个人信息与任意关联公司及合作方共享，无需逐次告知。</w:t>
+      </w:r>
+    </w:p>
+    <w:p>
+      <w:r>
+        <w:rPr>
+          <w:rFonts w:ascii="Times New Roman" w:hAnsi="Times New Roman" w:eastAsia="宋体"/>
+          <w:b/>
+        </w:rPr>
         <w:t>第十四条 暂停服务</w:t>
       </w:r>
     </w:p>
@@ -465,7 +498,7 @@
           <w:rFonts w:ascii="Times New Roman" w:hAnsi="Times New Roman" w:eastAsia="宋体"/>
           <w:b/>
         </w:rPr>
-        <w:t>第十八条 不可抗力</w:t>
+        <w:t>第十七条 不可抗力</w:t>
       </w:r>
     </w:p>
     <w:p>
@@ -473,7 +506,7 @@
         <w:rPr>
           <w:rFonts w:ascii="Times New Roman" w:hAnsi="Times New Roman" w:eastAsia="宋体"/>
         </w:rPr>
-        <w:t>18.1 不可抗力包括网络攻击、病毒、云服务商或基础软件供应商故障。</w:t>
+        <w:t>17.1 不可抗力包括网络攻击、病毒、云服务商或基础软件供应商故障。</w:t>
       </w:r>
     </w:p>
     <w:p>
@@ -482,7 +515,7 @@
           <w:rFonts w:ascii="Times New Roman" w:hAnsi="Times New Roman" w:eastAsia="宋体"/>
           <w:b/>
         </w:rPr>
-        <w:t>第十九条 通知与电子证据</w:t>
+        <w:t>第十八条 通知与电子证据</w:t>
       </w:r>
     </w:p>
     <w:p>
@@ -490,7 +523,7 @@
         <w:rPr>
           <w:rFonts w:ascii="Times New Roman" w:hAnsi="Times New Roman" w:eastAsia="宋体"/>
         </w:rPr>
-        <w:t>19.1 乙方向管理后台发送信息后即视为送达。</w:t>
+        <w:t>18.1 乙方向管理后台发送信息后即视为送达。</w:t>
       </w:r>
     </w:p>
     <w:p>
@@ -499,7 +532,7 @@
           <w:rFonts w:ascii="Times New Roman" w:hAnsi="Times New Roman" w:eastAsia="宋体"/>
           <w:b/>
         </w:rPr>
-        <w:t>第二十条 法律适用与争议解决</w:t>
+        <w:t>第十九条 法律适用与争议解决</w:t>
       </w:r>
     </w:p>
     <w:p>
@@ -507,7 +540,7 @@
         <w:rPr>
           <w:rFonts w:ascii="Times New Roman" w:hAnsi="Times New Roman" w:eastAsia="宋体"/>
         </w:rPr>
-        <w:t>20.1 协商不成的，任何一方均应向乙方住所地有管辖权的人民法院提起诉讼。</w:t>
+        <w:t>19.1 协商不成的，任何一方均应向乙方住所地有管辖权的人民法院提起诉讼。</w:t>
       </w:r>
     </w:p>
     <w:p>
@@ -516,7 +549,7 @@
           <w:rFonts w:ascii="Times New Roman" w:hAnsi="Times New Roman" w:eastAsia="宋体"/>
           <w:b/>
         </w:rPr>
-        <w:t>第二十一条 其他</w:t>
+        <w:t>第二十条 其他</w:t>
       </w:r>
     </w:p>
     <w:p>
@@ -524,7 +557,7 @@
         <w:rPr>
           <w:rFonts w:ascii="Times New Roman" w:hAnsi="Times New Roman" w:eastAsia="宋体"/>
         </w:rPr>
-        <w:t>21.1 乙方可将本合同转让给其关联公司或业务承继方，并通知甲方。</w:t>
+        <w:t>20.1 乙方可将本合同转让给其关联公司或业务承继方，并通知甲方。</w:t>
       </w:r>
     </w:p>
     <w:p>

</xml_diff>